<commit_message>
Fix: Updated some values of doc, spec power.
</commit_message>
<xml_diff>
--- a/docs/Design Doc.docx
+++ b/docs/Design Doc.docx
@@ -25,7 +25,7 @@
           <w:szCs w:val="46"/>
           <w:rtl w:val="0"/>
         </w:rPr>
-        <w:t xml:space="preserve">NMP Design Doc Template </w:t>
+        <w:t xml:space="preserve">NMP Design Doc</w:t>
       </w:r>
     </w:p>
     <w:p>
@@ -103,7 +103,7 @@
           <wp:inline distB="114300" distT="114300" distL="114300" distR="114300">
             <wp:extent cx="5943600" cy="2997200"/>
             <wp:effectExtent b="0" l="0" r="0" t="0"/>
-            <wp:docPr id="6" name="image5.png"/>
+            <wp:docPr id="7" name="image5.png"/>
             <a:graphic>
               <a:graphicData uri="http://schemas.openxmlformats.org/drawingml/2006/picture">
                 <pic:pic>
@@ -328,7 +328,7 @@
       <w:pPr>
         <w:numPr>
           <w:ilvl w:val="0"/>
-          <w:numId w:val="8"/>
+          <w:numId w:val="7"/>
         </w:numPr>
         <w:spacing w:after="0" w:afterAutospacing="0" w:before="240" w:lineRule="auto"/>
         <w:ind w:left="720" w:hanging="360"/>
@@ -344,7 +344,7 @@
       <w:pPr>
         <w:numPr>
           <w:ilvl w:val="0"/>
-          <w:numId w:val="8"/>
+          <w:numId w:val="7"/>
         </w:numPr>
         <w:spacing w:after="0" w:afterAutospacing="0" w:before="0" w:beforeAutospacing="0" w:lineRule="auto"/>
         <w:ind w:left="720" w:hanging="360"/>
@@ -360,7 +360,7 @@
       <w:pPr>
         <w:numPr>
           <w:ilvl w:val="0"/>
-          <w:numId w:val="8"/>
+          <w:numId w:val="7"/>
         </w:numPr>
         <w:spacing w:after="0" w:afterAutospacing="0" w:before="0" w:beforeAutospacing="0" w:lineRule="auto"/>
         <w:ind w:left="720" w:hanging="360"/>
@@ -376,7 +376,7 @@
       <w:pPr>
         <w:numPr>
           <w:ilvl w:val="0"/>
-          <w:numId w:val="8"/>
+          <w:numId w:val="7"/>
         </w:numPr>
         <w:spacing w:after="240" w:before="0" w:beforeAutospacing="0" w:lineRule="auto"/>
         <w:ind w:left="720" w:hanging="360"/>
@@ -462,14 +462,14 @@
         <w:rPr/>
         <w:drawing>
           <wp:inline distB="114300" distT="114300" distL="114300" distR="114300">
-            <wp:extent cx="5943600" cy="2171700"/>
+            <wp:extent cx="5943600" cy="1752600"/>
             <wp:effectExtent b="0" l="0" r="0" t="0"/>
-            <wp:docPr id="3" name="image3.png"/>
+            <wp:docPr id="6" name="image6.png"/>
             <a:graphic>
               <a:graphicData uri="http://schemas.openxmlformats.org/drawingml/2006/picture">
                 <pic:pic>
                   <pic:nvPicPr>
-                    <pic:cNvPr id="0" name="image3.png"/>
+                    <pic:cNvPr id="0" name="image6.png"/>
                     <pic:cNvPicPr preferRelativeResize="0"/>
                   </pic:nvPicPr>
                   <pic:blipFill>
@@ -482,7 +482,7 @@
                   <pic:spPr>
                     <a:xfrm>
                       <a:off x="0" y="0"/>
-                      <a:ext cx="5943600" cy="2171700"/>
+                      <a:ext cx="5943600" cy="1752600"/>
                     </a:xfrm>
                     <a:prstGeom prst="rect"/>
                     <a:ln/>
@@ -503,7 +503,7 @@
       <w:pPr>
         <w:numPr>
           <w:ilvl w:val="0"/>
-          <w:numId w:val="12"/>
+          <w:numId w:val="10"/>
         </w:numPr>
         <w:spacing w:after="240" w:before="240" w:lineRule="auto"/>
         <w:ind w:left="720" w:hanging="360"/>
@@ -520,7 +520,6 @@
         <w:rPr>
           <w:rtl w:val="0"/>
         </w:rPr>
-        <w:t xml:space="preserve"> every load on the 5 V rail and its current, then the total and the margin your converter gives.</w:t>
       </w:r>
     </w:p>
     <w:p>
@@ -1181,7 +1180,7 @@
                 <w:bCs w:val="1"/>
                 <w:rtl w:val="0"/>
               </w:rPr>
-              <w:t xml:space="preserve">Total</w:t>
+              <w:t xml:space="preserve">Total: ~300mA</w:t>
             </w:r>
           </w:p>
         </w:tc>
@@ -1243,42 +1242,14 @@
     </w:tbl>
     <w:p>
       <w:pPr>
-        <w:numPr>
-          <w:ilvl w:val="0"/>
-          <w:numId w:val="7"/>
-        </w:numPr>
-        <w:spacing w:after="0" w:afterAutospacing="0" w:before="240" w:lineRule="auto"/>
-        <w:ind w:left="720" w:hanging="360"/>
-      </w:pPr>
-      <w:r>
-        <w:rPr>
-          <w:b w:val="1"/>
-          <w:bCs w:val="1"/>
-          <w:rtl w:val="0"/>
-        </w:rPr>
-        <w:t xml:space="preserve">Converter comparison:</w:t>
-      </w:r>
-      <w:r>
-        <w:rPr>
-          <w:rtl w:val="0"/>
-        </w:rPr>
-        <w:t xml:space="preserve"> 2–3 DigiKey candidates on input range, output current/power, package, ripple, cost. Say why the winner won.</w:t>
-      </w:r>
-    </w:p>
-    <w:p>
-      <w:pPr>
-        <w:numPr>
-          <w:ilvl w:val="0"/>
-          <w:numId w:val="7"/>
-        </w:numPr>
-        <w:spacing w:after="240" w:before="0" w:beforeAutospacing="0" w:lineRule="auto"/>
-        <w:ind w:left="720" w:hanging="360"/>
-      </w:pPr>
-      <w:r>
-        <w:rPr>
-          <w:rtl w:val="0"/>
-        </w:rPr>
-        <w:t xml:space="preserve">One or two sentences on why DC-DC instead of a linear regulator, with the heat math.</w:t>
+        <w:spacing w:after="240" w:before="240" w:lineRule="auto"/>
+        <w:ind w:left="0" w:firstLine="0"/>
+        <w:rPr/>
+      </w:pPr>
+      <w:r>
+        <w:rPr>
+          <w:rtl w:val="0"/>
+        </w:rPr>
       </w:r>
     </w:p>
     <w:p>
@@ -2126,9 +2097,54 @@
     </w:p>
     <w:p>
       <w:pPr>
+        <w:rPr/>
+      </w:pPr>
+      <w:r>
+        <w:rPr/>
+        <w:drawing>
+          <wp:inline distB="114300" distT="114300" distL="114300" distR="114300">
+            <wp:extent cx="5943600" cy="4597400"/>
+            <wp:effectExtent b="0" l="0" r="0" t="0"/>
+            <wp:docPr id="8" name="image7.png"/>
+            <a:graphic>
+              <a:graphicData uri="http://schemas.openxmlformats.org/drawingml/2006/picture">
+                <pic:pic>
+                  <pic:nvPicPr>
+                    <pic:cNvPr id="0" name="image7.png"/>
+                    <pic:cNvPicPr preferRelativeResize="0"/>
+                  </pic:nvPicPr>
+                  <pic:blipFill>
+                    <a:blip r:embed="rId8"/>
+                    <a:srcRect b="0" l="0" r="0" t="0"/>
+                    <a:stretch>
+                      <a:fillRect/>
+                    </a:stretch>
+                  </pic:blipFill>
+                  <pic:spPr>
+                    <a:xfrm>
+                      <a:off x="0" y="0"/>
+                      <a:ext cx="5943600" cy="4597400"/>
+                    </a:xfrm>
+                    <a:prstGeom prst="rect"/>
+                    <a:ln/>
+                  </pic:spPr>
+                </pic:pic>
+              </a:graphicData>
+            </a:graphic>
+          </wp:inline>
+        </w:drawing>
+      </w:r>
+      <w:r>
+        <w:rPr>
+          <w:rtl w:val="0"/>
+        </w:rPr>
+      </w:r>
+    </w:p>
+    <w:p>
+      <w:pPr>
         <w:numPr>
           <w:ilvl w:val="0"/>
-          <w:numId w:val="17"/>
+          <w:numId w:val="15"/>
         </w:numPr>
         <w:spacing w:after="240" w:before="240" w:lineRule="auto"/>
         <w:ind w:left="720" w:hanging="360"/>
@@ -2152,16 +2168,16 @@
           <wp:inline distB="114300" distT="114300" distL="114300" distR="114300">
             <wp:extent cx="5943600" cy="3314700"/>
             <wp:effectExtent b="0" l="0" r="0" t="0"/>
-            <wp:docPr id="1" name="image1.png"/>
+            <wp:docPr id="1" name="image3.png"/>
             <a:graphic>
               <a:graphicData uri="http://schemas.openxmlformats.org/drawingml/2006/picture">
                 <pic:pic>
                   <pic:nvPicPr>
-                    <pic:cNvPr id="0" name="image1.png"/>
+                    <pic:cNvPr id="0" name="image3.png"/>
                     <pic:cNvPicPr preferRelativeResize="0"/>
                   </pic:nvPicPr>
                   <pic:blipFill>
-                    <a:blip r:embed="rId8"/>
+                    <a:blip r:embed="rId9"/>
                     <a:srcRect b="0" l="0" r="0" t="0"/>
                     <a:stretch>
                       <a:fillRect/>
@@ -2191,7 +2207,7 @@
       <w:pPr>
         <w:numPr>
           <w:ilvl w:val="0"/>
-          <w:numId w:val="17"/>
+          <w:numId w:val="15"/>
         </w:numPr>
         <w:spacing w:after="0" w:afterAutospacing="0" w:before="240" w:lineRule="auto"/>
         <w:ind w:left="720" w:hanging="360"/>
@@ -2200,14 +2216,14 @@
         <w:rPr>
           <w:rtl w:val="0"/>
         </w:rPr>
-        <w:t xml:space="preserve">Enable/inhibit wiring, supply pins, and on-resistance (typical and worst case) from each datasheet, and why it's acceptable.</w:t>
+        <w:t xml:space="preserve">The Mux’s Enable pins are also connected to the microcontroller, however, this is held low as this sets the IC as a multiplexor.</w:t>
       </w:r>
     </w:p>
     <w:p>
       <w:pPr>
         <w:numPr>
           <w:ilvl w:val="0"/>
-          <w:numId w:val="17"/>
+          <w:numId w:val="15"/>
         </w:numPr>
         <w:spacing w:after="0" w:afterAutospacing="0" w:before="0" w:beforeAutospacing="0" w:lineRule="auto"/>
         <w:ind w:left="720" w:hanging="360"/>
@@ -2219,14 +2235,33 @@
         <w:rPr>
           <w:rtl w:val="0"/>
         </w:rPr>
-        <w:t xml:space="preserve">The mux has a ON resistance of about 160 ohms at worst and 70 ohm typical</w:t>
+        <w:t xml:space="preserve">The MUX is also supplied with 5v as is acceptable within the 2-6v range on the datasheet.</w:t>
       </w:r>
     </w:p>
     <w:p>
       <w:pPr>
         <w:numPr>
           <w:ilvl w:val="0"/>
-          <w:numId w:val="17"/>
+          <w:numId w:val="15"/>
+        </w:numPr>
+        <w:spacing w:after="0" w:afterAutospacing="0" w:before="0" w:beforeAutospacing="0" w:lineRule="auto"/>
+        <w:ind w:left="720" w:hanging="360"/>
+        <w:rPr>
+          <w:u w:val="none"/>
+        </w:rPr>
+      </w:pPr>
+      <w:r>
+        <w:rPr>
+          <w:rtl w:val="0"/>
+        </w:rPr>
+        <w:t xml:space="preserve">The mux has a ON resistance of about 160 ohms at worst and 70 ohm typical</w:t>
+      </w:r>
+    </w:p>
+    <w:p>
+      <w:pPr>
+        <w:numPr>
+          <w:ilvl w:val="0"/>
+          <w:numId w:val="15"/>
         </w:numPr>
         <w:spacing w:after="240" w:before="0" w:beforeAutospacing="0" w:lineRule="auto"/>
         <w:ind w:left="720" w:hanging="360"/>
@@ -2300,14 +2335,14 @@
         <w:rPr>
           <w:rtl w:val="0"/>
         </w:rPr>
-        <w:t xml:space="preserve">C 14 pF nano</w:t>
+        <w:t xml:space="preserve">C 56 pF nano</w:t>
       </w:r>
     </w:p>
     <w:p>
       <w:pPr>
         <w:numPr>
           <w:ilvl w:val="0"/>
-          <w:numId w:val="14"/>
+          <w:numId w:val="12"/>
         </w:numPr>
         <w:spacing w:after="240" w:before="240" w:lineRule="auto"/>
         <w:ind w:left="720" w:hanging="360"/>
@@ -2319,7 +2354,7 @@
         <w:rPr>
           <w:rtl w:val="0"/>
         </w:rPr>
-        <w:t xml:space="preserve">To solve the issue of reading this settling delay a software delay of 1 nanosecond is added.</w:t>
+        <w:t xml:space="preserve">Despite this low estimated settling time, non-idealities from the breadboard could make this settling delay longer. To solve the issue of reading this settling delay a software delay of 1 microsecond is added.</w:t>
       </w:r>
     </w:p>
     <w:p>
@@ -2372,7 +2407,7 @@
           <wp:inline distB="114300" distT="114300" distL="114300" distR="114300">
             <wp:extent cx="5943600" cy="2514600"/>
             <wp:effectExtent b="0" l="0" r="0" t="0"/>
-            <wp:docPr id="4" name="image2.png"/>
+            <wp:docPr id="3" name="image2.png"/>
             <a:graphic>
               <a:graphicData uri="http://schemas.openxmlformats.org/drawingml/2006/picture">
                 <pic:pic>
@@ -2381,7 +2416,7 @@
                     <pic:cNvPicPr preferRelativeResize="0"/>
                   </pic:nvPicPr>
                   <pic:blipFill>
-                    <a:blip r:embed="rId9"/>
+                    <a:blip r:embed="rId10"/>
                     <a:srcRect b="0" l="0" r="0" t="0"/>
                     <a:stretch>
                       <a:fillRect/>
@@ -2477,27 +2512,21 @@
         <w:rPr/>
       </w:pPr>
       <w:r>
-        <w:rPr>
-          <w:rtl w:val="0"/>
-        </w:rPr>
-        <w:t xml:space="preserve">s</w:t>
-      </w:r>
-      <w:r>
         <w:rPr/>
         <w:drawing>
           <wp:inline distB="114300" distT="114300" distL="114300" distR="114300">
             <wp:extent cx="5943600" cy="2768600"/>
             <wp:effectExtent b="0" l="0" r="0" t="0"/>
-            <wp:docPr id="5" name="image4.png"/>
+            <wp:docPr id="5" name="image1.png"/>
             <a:graphic>
               <a:graphicData uri="http://schemas.openxmlformats.org/drawingml/2006/picture">
                 <pic:pic>
                   <pic:nvPicPr>
-                    <pic:cNvPr id="0" name="image4.png"/>
+                    <pic:cNvPr id="0" name="image1.png"/>
                     <pic:cNvPicPr preferRelativeResize="0"/>
                   </pic:nvPicPr>
                   <pic:blipFill>
-                    <a:blip r:embed="rId10"/>
+                    <a:blip r:embed="rId11"/>
                     <a:srcRect b="0" l="0" r="0" t="0"/>
                     <a:stretch>
                       <a:fillRect/>
@@ -2529,31 +2558,14 @@
           <w:ilvl w:val="0"/>
           <w:numId w:val="2"/>
         </w:numPr>
-        <w:spacing w:after="0" w:afterAutospacing="0" w:before="240" w:lineRule="auto"/>
-        <w:ind w:left="720" w:hanging="360"/>
-      </w:pPr>
-      <w:r>
-        <w:rPr>
-          <w:rFonts w:ascii="Arial Unicode MS" w:cs="Arial Unicode MS" w:eastAsia="Arial Unicode MS" w:hAnsi="Arial Unicode MS"/>
-          <w:rtl w:val="0"/>
-        </w:rPr>
-        <w:t xml:space="preserve">Pin assignment table: pin → function (select lines, analog input, LED, SDA A4, SCL A5).</w:t>
-      </w:r>
-    </w:p>
-    <w:p>
-      <w:pPr>
-        <w:numPr>
-          <w:ilvl w:val="0"/>
-          <w:numId w:val="2"/>
-        </w:numPr>
-        <w:spacing w:after="240" w:before="0" w:beforeAutospacing="0" w:lineRule="auto"/>
-        <w:ind w:left="720" w:hanging="360"/>
-      </w:pPr>
-      <w:r>
-        <w:rPr>
-          <w:rtl w:val="0"/>
-        </w:rPr>
-        <w:t xml:space="preserve">ADC: 10-bit, 5 V reference, LSB 4.88 mV, conversion formula.</w:t>
+        <w:spacing w:after="240" w:before="240" w:lineRule="auto"/>
+        <w:ind w:left="720" w:hanging="360"/>
+      </w:pPr>
+      <w:r>
+        <w:rPr>
+          <w:rtl w:val="0"/>
+        </w:rPr>
+        <w:t xml:space="preserve">ADC: 10-bit, 5 V reference</w:t>
       </w:r>
     </w:p>
     <w:p>
@@ -2586,34 +2598,47 @@
     </w:p>
     <w:p>
       <w:pPr>
-        <w:numPr>
-          <w:ilvl w:val="0"/>
-          <w:numId w:val="10"/>
-        </w:numPr>
-        <w:spacing w:after="0" w:afterAutospacing="0" w:before="240" w:lineRule="auto"/>
-        <w:ind w:left="720" w:hanging="360"/>
-      </w:pPr>
-      <w:r>
-        <w:rPr>
-          <w:rtl w:val="0"/>
-        </w:rPr>
-        <w:t xml:space="preserve">LED resistor calculation: formula, numbers, chosen standard value.</w:t>
-      </w:r>
-    </w:p>
-    <w:p>
-      <w:pPr>
-        <w:numPr>
-          <w:ilvl w:val="0"/>
-          <w:numId w:val="10"/>
-        </w:numPr>
-        <w:spacing w:after="240" w:before="0" w:beforeAutospacing="0" w:lineRule="auto"/>
-        <w:ind w:left="720" w:hanging="360"/>
-      </w:pPr>
-      <w:r>
-        <w:rPr>
-          <w:rtl w:val="0"/>
-        </w:rPr>
-        <w:t xml:space="preserve">What each LED pattern means, and the 60°C threshold with any hysteresis.</w:t>
+        <w:rPr/>
+      </w:pPr>
+      <w:r>
+        <w:rPr/>
+        <w:drawing>
+          <wp:inline distB="114300" distT="114300" distL="114300" distR="114300">
+            <wp:extent cx="5943600" cy="5295900"/>
+            <wp:effectExtent b="0" l="0" r="0" t="0"/>
+            <wp:docPr id="4" name="image4.png"/>
+            <a:graphic>
+              <a:graphicData uri="http://schemas.openxmlformats.org/drawingml/2006/picture">
+                <pic:pic>
+                  <pic:nvPicPr>
+                    <pic:cNvPr id="0" name="image4.png"/>
+                    <pic:cNvPicPr preferRelativeResize="0"/>
+                  </pic:nvPicPr>
+                  <pic:blipFill>
+                    <a:blip r:embed="rId12"/>
+                    <a:srcRect b="0" l="0" r="0" t="0"/>
+                    <a:stretch>
+                      <a:fillRect/>
+                    </a:stretch>
+                  </pic:blipFill>
+                  <pic:spPr>
+                    <a:xfrm>
+                      <a:off x="0" y="0"/>
+                      <a:ext cx="5943600" cy="5295900"/>
+                    </a:xfrm>
+                    <a:prstGeom prst="rect"/>
+                    <a:ln/>
+                  </pic:spPr>
+                </pic:pic>
+              </a:graphicData>
+            </a:graphic>
+          </wp:inline>
+        </w:drawing>
+      </w:r>
+      <w:r>
+        <w:rPr>
+          <w:rtl w:val="0"/>
+        </w:rPr>
       </w:r>
     </w:p>
     <w:p>
@@ -2622,49 +2647,51 @@
         <w:keepNext w:val="0"/>
         <w:keepLines w:val="0"/>
         <w:spacing w:before="280" w:lineRule="auto"/>
+        <w:rPr/>
+      </w:pPr>
+      <w:bookmarkStart w:colFirst="0" w:colLast="0" w:name="_ar25d5sreb4p" w:id="10"/>
+      <w:bookmarkEnd w:id="10"/>
+      <w:r>
         <w:rPr>
           <w:b w:val="1"/>
           <w:bCs w:val="1"/>
           <w:color w:val="000000"/>
           <w:sz w:val="26"/>
           <w:szCs w:val="26"/>
-        </w:rPr>
-      </w:pPr>
-      <w:bookmarkStart w:colFirst="0" w:colLast="0" w:name="_ar25d5sreb4p" w:id="10"/>
-      <w:bookmarkEnd w:id="10"/>
-      <w:r>
-        <w:rPr>
-          <w:b w:val="1"/>
-          <w:bCs w:val="1"/>
-          <w:color w:val="000000"/>
-          <w:sz w:val="26"/>
-          <w:szCs w:val="26"/>
           <w:rtl w:val="0"/>
         </w:rPr>
         <w:t xml:space="preserve">3.7 I2C</w:t>
+      </w:r>
+      <w:r>
+        <w:rPr>
+          <w:rtl w:val="0"/>
+        </w:rPr>
       </w:r>
     </w:p>
     <w:p>
       <w:pPr>
         <w:numPr>
           <w:ilvl w:val="0"/>
-          <w:numId w:val="16"/>
+          <w:numId w:val="14"/>
         </w:numPr>
         <w:spacing w:after="0" w:afterAutospacing="0" w:before="240" w:lineRule="auto"/>
         <w:ind w:left="720" w:hanging="360"/>
-      </w:pPr>
-      <w:r>
-        <w:rPr>
-          <w:rtl w:val="0"/>
-        </w:rPr>
-        <w:t xml:space="preserve">Role and address, pull-up resistor values and why</w:t>
+        <w:rPr>
+          <w:u w:val="none"/>
+        </w:rPr>
+      </w:pPr>
+      <w:r>
+        <w:rPr>
+          <w:rtl w:val="0"/>
+        </w:rPr>
+        <w:t xml:space="preserve">The temperature that the Arduino nano produces is then emitted via I2C to other boards</w:t>
       </w:r>
     </w:p>
     <w:p>
       <w:pPr>
         <w:numPr>
           <w:ilvl w:val="0"/>
-          <w:numId w:val="16"/>
+          <w:numId w:val="14"/>
         </w:numPr>
         <w:spacing w:after="240" w:before="0" w:beforeAutospacing="0" w:lineRule="auto"/>
         <w:ind w:left="720" w:hanging="360"/>
@@ -2748,16 +2775,16 @@
           <wp:inline distB="114300" distT="114300" distL="114300" distR="114300">
             <wp:extent cx="5329238" cy="6712534"/>
             <wp:effectExtent b="0" l="0" r="0" t="0"/>
-            <wp:docPr id="2" name="image6.png"/>
+            <wp:docPr id="2" name="image8.png"/>
             <a:graphic>
               <a:graphicData uri="http://schemas.openxmlformats.org/drawingml/2006/picture">
                 <pic:pic>
                   <pic:nvPicPr>
-                    <pic:cNvPr id="0" name="image6.png"/>
+                    <pic:cNvPr id="0" name="image8.png"/>
                     <pic:cNvPicPr preferRelativeResize="0"/>
                   </pic:nvPicPr>
                   <pic:blipFill>
-                    <a:blip r:embed="rId11"/>
+                    <a:blip r:embed="rId13"/>
                     <a:srcRect b="0" l="0" r="0" t="0"/>
                     <a:stretch>
                       <a:fillRect/>
@@ -2925,7 +2952,7 @@
       <w:pPr>
         <w:numPr>
           <w:ilvl w:val="0"/>
-          <w:numId w:val="13"/>
+          <w:numId w:val="11"/>
         </w:numPr>
         <w:spacing w:after="0" w:afterAutospacing="0" w:before="240" w:lineRule="auto"/>
         <w:ind w:left="720" w:hanging="360"/>
@@ -2935,6 +2962,454 @@
           <w:rtl w:val="0"/>
         </w:rPr>
         <w:t xml:space="preserve">channelSelector(channel): sets the MUX select lines to the binary value of the channel. Returns nothing.</w:t>
+      </w:r>
+    </w:p>
+    <w:p>
+      <w:pPr>
+        <w:numPr>
+          <w:ilvl w:val="0"/>
+          <w:numId w:val="11"/>
+        </w:numPr>
+        <w:spacing w:after="0" w:afterAutospacing="0" w:before="0" w:beforeAutospacing="0" w:lineRule="auto"/>
+        <w:ind w:left="720" w:hanging="360"/>
+      </w:pPr>
+      <w:r>
+        <w:rPr>
+          <w:rtl w:val="0"/>
+        </w:rPr>
+        <w:t xml:space="preserve">readingToTemp(reading): converts an ADC reading to °C by calling stepsToVoltage, then voltageToTemp</w:t>
+      </w:r>
+    </w:p>
+    <w:p>
+      <w:pPr>
+        <w:numPr>
+          <w:ilvl w:val="0"/>
+          <w:numId w:val="11"/>
+        </w:numPr>
+        <w:spacing w:after="0" w:afterAutospacing="0" w:before="0" w:beforeAutospacing="0" w:lineRule="auto"/>
+        <w:ind w:left="720" w:hanging="360"/>
+      </w:pPr>
+      <w:r>
+        <w:rPr>
+          <w:rtl w:val="0"/>
+        </w:rPr>
+        <w:t xml:space="preserve">findHighest(temperatures, count): returns the highest temperature in array</w:t>
+      </w:r>
+    </w:p>
+    <w:p>
+      <w:pPr>
+        <w:numPr>
+          <w:ilvl w:val="0"/>
+          <w:numId w:val="11"/>
+        </w:numPr>
+        <w:spacing w:after="0" w:afterAutospacing="0" w:before="0" w:beforeAutospacing="0" w:lineRule="auto"/>
+        <w:ind w:left="720" w:hanging="360"/>
+      </w:pPr>
+      <w:r>
+        <w:rPr>
+          <w:rtl w:val="0"/>
+        </w:rPr>
+        <w:t xml:space="preserve">checkLed(temperature): returns true if the temperature in argument is above 60 °C.</w:t>
+      </w:r>
+    </w:p>
+    <w:p>
+      <w:pPr>
+        <w:numPr>
+          <w:ilvl w:val="0"/>
+          <w:numId w:val="11"/>
+        </w:numPr>
+        <w:spacing w:after="0" w:afterAutospacing="0" w:before="0" w:beforeAutospacing="0" w:lineRule="auto"/>
+        <w:ind w:left="720" w:hanging="360"/>
+      </w:pPr>
+      <w:r>
+        <w:rPr>
+          <w:rtl w:val="0"/>
+        </w:rPr>
+        <w:t xml:space="preserve">ledControl(fault): Controls LED. Returns nothing.</w:t>
+      </w:r>
+    </w:p>
+    <w:p>
+      <w:pPr>
+        <w:numPr>
+          <w:ilvl w:val="0"/>
+          <w:numId w:val="11"/>
+        </w:numPr>
+        <w:spacing w:after="0" w:afterAutospacing="0" w:before="0" w:beforeAutospacing="0" w:lineRule="auto"/>
+        <w:ind w:left="720" w:hanging="360"/>
+      </w:pPr>
+      <w:r>
+        <w:rPr>
+          <w:rtl w:val="0"/>
+        </w:rPr>
+        <w:t xml:space="preserve">i2cSend(temperature): sends the highest temperature over I2C. Returns nothing.</w:t>
+      </w:r>
+    </w:p>
+    <w:p>
+      <w:pPr>
+        <w:numPr>
+          <w:ilvl w:val="0"/>
+          <w:numId w:val="11"/>
+        </w:numPr>
+        <w:spacing w:after="240" w:before="0" w:beforeAutospacing="0" w:lineRule="auto"/>
+        <w:ind w:left="720" w:hanging="360"/>
+        <w:rPr>
+          <w:u w:val="none"/>
+        </w:rPr>
+      </w:pPr>
+      <w:r>
+        <w:rPr>
+          <w:rtl w:val="0"/>
+        </w:rPr>
+        <w:t xml:space="preserve">analogRead(pin): built-in Arduino function [3]. Reads the voltage on the given analog pin (the mux output, </w:t>
+      </w:r>
+      <w:r>
+        <w:rPr>
+          <w:rFonts w:ascii="Roboto Mono" w:cs="Roboto Mono" w:eastAsia="Roboto Mono" w:hAnsi="Roboto Mono"/>
+          <w:color w:val="188038"/>
+          <w:rtl w:val="0"/>
+        </w:rPr>
+        <w:t xml:space="preserve">MUX_PIN</w:t>
+      </w:r>
+      <w:r>
+        <w:rPr>
+          <w:rtl w:val="0"/>
+        </w:rPr>
+        <w:t xml:space="preserve">) with the 10-bit ADC and returns a value from 0 to 1023. </w:t>
+      </w:r>
+    </w:p>
+    <w:p>
+      <w:pPr>
+        <w:spacing w:after="240" w:before="240" w:lineRule="auto"/>
+        <w:ind w:left="720" w:firstLine="0"/>
+        <w:rPr/>
+      </w:pPr>
+      <w:r>
+        <w:rPr>
+          <w:rtl w:val="0"/>
+        </w:rPr>
+        <w:t xml:space="preserve">Helper Functions</w:t>
+      </w:r>
+    </w:p>
+    <w:p>
+      <w:pPr>
+        <w:numPr>
+          <w:ilvl w:val="0"/>
+          <w:numId w:val="11"/>
+        </w:numPr>
+        <w:spacing w:after="0" w:afterAutospacing="0" w:before="240" w:lineRule="auto"/>
+        <w:ind w:left="720" w:hanging="360"/>
+      </w:pPr>
+      <w:r>
+        <w:rPr>
+          <w:rtl w:val="0"/>
+        </w:rPr>
+        <w:t xml:space="preserve">stepsToVoltage(reading): converts an ADC reading to volts: V = reading × V_ref ÷ 1024.</w:t>
+      </w:r>
+    </w:p>
+    <w:p>
+      <w:pPr>
+        <w:numPr>
+          <w:ilvl w:val="0"/>
+          <w:numId w:val="11"/>
+        </w:numPr>
+        <w:spacing w:after="240" w:before="0" w:beforeAutospacing="0" w:lineRule="auto"/>
+        <w:ind w:left="720" w:hanging="360"/>
+      </w:pPr>
+      <w:r>
+        <w:rPr>
+          <w:rtl w:val="0"/>
+        </w:rPr>
+        <w:t xml:space="preserve">voltageToTemp(voltage): converts volts to °C using the datasheet table.</w:t>
+      </w:r>
+    </w:p>
+    <w:p>
+      <w:pPr>
+        <w:spacing w:after="240" w:before="240" w:lineRule="auto"/>
+        <w:rPr>
+          <w:b w:val="1"/>
+          <w:bCs w:val="1"/>
+        </w:rPr>
+      </w:pPr>
+      <w:r>
+        <w:rPr>
+          <w:b w:val="1"/>
+          <w:bCs w:val="1"/>
+          <w:rtl w:val="0"/>
+        </w:rPr>
+        <w:t xml:space="preserve">4.2 Design decisions</w:t>
+      </w:r>
+    </w:p>
+    <w:p>
+      <w:pPr>
+        <w:numPr>
+          <w:ilvl w:val="0"/>
+          <w:numId w:val="9"/>
+        </w:numPr>
+        <w:spacing w:after="0" w:afterAutospacing="0" w:before="240" w:lineRule="auto"/>
+        <w:ind w:left="720" w:hanging="360"/>
+      </w:pPr>
+      <w:r>
+        <w:rPr>
+          <w:rtl w:val="0"/>
+        </w:rPr>
+        <w:t xml:space="preserve">One value per conversion function. Each conversion helper takes one value and returns one value, so each can be tested against hand calculations: for example, a reading of 400 should give 1.9531 V and 17.63 °C. loop() stores each result in the array.</w:t>
+      </w:r>
+    </w:p>
+    <w:p>
+      <w:pPr>
+        <w:numPr>
+          <w:ilvl w:val="0"/>
+          <w:numId w:val="9"/>
+        </w:numPr>
+        <w:spacing w:after="0" w:afterAutospacing="0" w:before="0" w:beforeAutospacing="0" w:lineRule="auto"/>
+        <w:ind w:left="720" w:hanging="360"/>
+      </w:pPr>
+      <w:r>
+        <w:rPr>
+          <w:rFonts w:ascii="Arial Unicode MS" w:cs="Arial Unicode MS" w:eastAsia="Arial Unicode MS" w:hAnsi="Arial Unicode MS"/>
+          <w:rtl w:val="0"/>
+        </w:rPr>
+        <w:t xml:space="preserve">Sensor table as a constant. The 33 datasheet voltages (−40 °C to 120 °C in 5 °C steps) are stored once as a const array. Temperatures are evenly spaced, so a table index converts directly to a temperature and only voltages need storing.[1]</w:t>
+      </w:r>
+    </w:p>
+    <w:p>
+      <w:pPr>
+        <w:numPr>
+          <w:ilvl w:val="0"/>
+          <w:numId w:val="9"/>
+        </w:numPr>
+        <w:spacing w:after="0" w:afterAutospacing="0" w:before="0" w:beforeAutospacing="0" w:lineRule="auto"/>
+        <w:ind w:left="720" w:hanging="360"/>
+      </w:pPr>
+      <w:r>
+        <w:rPr>
+          <w:rtl w:val="0"/>
+        </w:rPr>
+        <w:t xml:space="preserve">Channel count as a single constant.[4,5] NUM_CHANNELS sizes the array and bounds the loop. It is 16 for the CD74HC4067 schematic and 8 for the CD4051BE build, so switching requires one edit. The CD4051BE also uses 3 select lines instead of 4, so the select-line pin constants change with it.</w:t>
+      </w:r>
+    </w:p>
+    <w:p>
+      <w:pPr>
+        <w:numPr>
+          <w:ilvl w:val="0"/>
+          <w:numId w:val="9"/>
+        </w:numPr>
+        <w:spacing w:after="0" w:afterAutospacing="0" w:before="0" w:beforeAutospacing="0" w:lineRule="auto"/>
+        <w:ind w:left="720" w:hanging="360"/>
+      </w:pPr>
+      <w:r>
+        <w:rPr>
+          <w:rtl w:val="0"/>
+        </w:rPr>
+        <w:t xml:space="preserve">Temperature array passed with its count. findHighest receives the array and the count as arguments rather than reading a global, so it works for any channel count and can be tested with made-up arrays.</w:t>
+      </w:r>
+    </w:p>
+    <w:p>
+      <w:pPr>
+        <w:numPr>
+          <w:ilvl w:val="0"/>
+          <w:numId w:val="9"/>
+        </w:numPr>
+        <w:spacing w:after="0" w:afterAutospacing="0" w:before="0" w:beforeAutospacing="0" w:lineRule="auto"/>
+        <w:ind w:left="720" w:hanging="360"/>
+      </w:pPr>
+      <w:r>
+        <w:rPr>
+          <w:rtl w:val="0"/>
+        </w:rPr>
+        <w:t xml:space="preserve">The sensor is non-linear, and the datasheet recommends linear interpolation between table values for reasonable accuracy, so I just used that.</w:t>
+      </w:r>
+    </w:p>
+    <w:p>
+      <w:pPr>
+        <w:numPr>
+          <w:ilvl w:val="0"/>
+          <w:numId w:val="9"/>
+        </w:numPr>
+        <w:spacing w:after="0" w:afterAutospacing="0" w:before="0" w:beforeAutospacing="0" w:lineRule="auto"/>
+        <w:ind w:left="720" w:hanging="360"/>
+        <w:rPr>
+          <w:u w:val="none"/>
+        </w:rPr>
+      </w:pPr>
+      <w:r>
+        <w:rPr>
+          <w:rtl w:val="0"/>
+        </w:rPr>
+        <w:t xml:space="preserve">I thought about using a 2d array but realized that temperature is evenly spaced so there was no need to store.</w:t>
+      </w:r>
+    </w:p>
+    <w:p>
+      <w:pPr>
+        <w:numPr>
+          <w:ilvl w:val="0"/>
+          <w:numId w:val="9"/>
+        </w:numPr>
+        <w:spacing w:after="0" w:afterAutospacing="0" w:before="0" w:beforeAutospacing="0" w:lineRule="auto"/>
+        <w:ind w:left="720" w:hanging="360"/>
+      </w:pPr>
+      <w:r>
+        <w:rPr>
+          <w:rtl w:val="0"/>
+        </w:rPr>
+        <w:t xml:space="preserve">ADC conversion uses 1024,[2] matching the ATmega328P datasheet’s conversion formula. The difference from 1023 is about 0.1%.</w:t>
+      </w:r>
+    </w:p>
+    <w:p>
+      <w:pPr>
+        <w:numPr>
+          <w:ilvl w:val="0"/>
+          <w:numId w:val="9"/>
+        </w:numPr>
+        <w:spacing w:after="240" w:before="0" w:beforeAutospacing="0" w:lineRule="auto"/>
+        <w:ind w:left="720" w:hanging="360"/>
+      </w:pPr>
+      <w:r>
+        <w:rPr>
+          <w:rtl w:val="0"/>
+        </w:rPr>
+        <w:t xml:space="preserve">MUX settling. After switching channels, the firmware waits briefly before reading so the output reflects the newly selected sensor. The delay is sized during the build phase.</w:t>
+      </w:r>
+    </w:p>
+    <w:p>
+      <w:pPr>
+        <w:spacing w:after="240" w:before="240" w:lineRule="auto"/>
+        <w:ind w:left="0" w:firstLine="0"/>
+        <w:rPr>
+          <w:b w:val="1"/>
+          <w:bCs w:val="1"/>
+        </w:rPr>
+      </w:pPr>
+      <w:r>
+        <w:rPr>
+          <w:b w:val="1"/>
+          <w:bCs w:val="1"/>
+          <w:rtl w:val="0"/>
+        </w:rPr>
+        <w:t xml:space="preserve">4.3 Math Explanation</w:t>
+      </w:r>
+    </w:p>
+    <w:p>
+      <w:pPr>
+        <w:spacing w:after="240" w:before="240" w:lineRule="auto"/>
+        <w:ind w:left="0" w:firstLine="0"/>
+        <w:rPr/>
+      </w:pPr>
+      <w:r>
+        <w:rPr>
+          <w:rtl w:val="0"/>
+        </w:rPr>
+        <w:t xml:space="preserve">Step 1: ADC reading to voltage: The Nano's ADC is 10-bit, so the reading is numbered from 0 to 1023, with a 5 V reference, so V = reading × 5 / 1024 One count (LSB) is 5 / 1024 = 4.88 mV.[2] </w:t>
+      </w:r>
+    </w:p>
+    <w:p>
+      <w:pPr>
+        <w:spacing w:after="240" w:before="240" w:lineRule="auto"/>
+        <w:ind w:left="0" w:firstLine="0"/>
+        <w:rPr/>
+      </w:pPr>
+      <w:r>
+        <w:rPr>
+          <w:rFonts w:ascii="Arial Unicode MS" w:cs="Arial Unicode MS" w:eastAsia="Arial Unicode MS" w:hAnsi="Arial Unicode MS"/>
+          <w:rtl w:val="0"/>
+        </w:rPr>
+        <w:t xml:space="preserve">Step 2: Voltage to temperature (linear interpolation) The sensor table lists voltages from −40 °C to 120 °C in 5 °C steps. Table index k corresponds to: T(k) = −40 + 5k The firmware finds the two entries the voltage falls between, V(k) ≥ V &gt; V(k+1), and interpolates linearly: fraction = (V(k) − V) / (V(k) − V(k+1)) T = T(k) + 5 × fraction Because the sensor's voltage falls as temperature rises, V(k) is the higher voltage and T(k) the lower temperature.</w:t>
+      </w:r>
+    </w:p>
+    <w:p>
+      <w:pPr>
+        <w:spacing w:after="240" w:before="240" w:lineRule="auto"/>
+        <w:ind w:left="0" w:firstLine="0"/>
+        <w:rPr/>
+      </w:pPr>
+      <w:r>
+        <w:rPr>
+          <w:rtl w:val="0"/>
+        </w:rPr>
+        <w:t xml:space="preserve"> Worked example 1: </w:t>
+      </w:r>
+    </w:p>
+    <w:p>
+      <w:pPr>
+        <w:numPr>
+          <w:ilvl w:val="0"/>
+          <w:numId w:val="8"/>
+        </w:numPr>
+        <w:spacing w:after="0" w:afterAutospacing="0" w:before="240" w:lineRule="auto"/>
+        <w:ind w:left="720" w:hanging="360"/>
+        <w:rPr>
+          <w:u w:val="none"/>
+        </w:rPr>
+      </w:pPr>
+      <w:r>
+        <w:rPr>
+          <w:rtl w:val="0"/>
+        </w:rPr>
+        <w:t xml:space="preserve">Reading 400 V = 400 × 5 / 1024 = 1.9531 V </w:t>
+      </w:r>
+    </w:p>
+    <w:p>
+      <w:pPr>
+        <w:numPr>
+          <w:ilvl w:val="0"/>
+          <w:numId w:val="8"/>
+        </w:numPr>
+        <w:spacing w:after="0" w:afterAutospacing="0" w:before="0" w:beforeAutospacing="0" w:lineRule="auto"/>
+        <w:ind w:left="720" w:hanging="360"/>
+        <w:rPr>
+          <w:u w:val="none"/>
+        </w:rPr>
+      </w:pPr>
+      <w:r>
+        <w:rPr>
+          <w:rFonts w:ascii="Arial Unicode MS" w:cs="Arial Unicode MS" w:eastAsia="Arial Unicode MS" w:hAnsi="Arial Unicode MS"/>
+          <w:rtl w:val="0"/>
+        </w:rPr>
+        <w:t xml:space="preserve">15 °C (1.99 V) and 20 °C (1.92 V) fraction = (1.99 − 1.9531) / (1.99 − 1.92) = 0.0369 / 0.07 = 0.527</w:t>
+      </w:r>
+    </w:p>
+    <w:p>
+      <w:pPr>
+        <w:numPr>
+          <w:ilvl w:val="0"/>
+          <w:numId w:val="8"/>
+        </w:numPr>
+        <w:spacing w:after="240" w:before="0" w:beforeAutospacing="0" w:lineRule="auto"/>
+        <w:ind w:left="720" w:hanging="360"/>
+        <w:rPr>
+          <w:u w:val="none"/>
+        </w:rPr>
+      </w:pPr>
+      <w:r>
+        <w:rPr>
+          <w:rtl w:val="0"/>
+        </w:rPr>
+        <w:t xml:space="preserve">15 + 5 × 0.527 = 17.63 °C (no fault</w:t>
+      </w:r>
+      <w:r>
+        <w:rPr>
+          <w:b w:val="1"/>
+          <w:bCs w:val="1"/>
+          <w:rtl w:val="0"/>
+        </w:rPr>
+        <w:t xml:space="preserve">) </w:t>
+      </w:r>
+    </w:p>
+    <w:p>
+      <w:pPr>
+        <w:spacing w:after="240" w:before="240" w:lineRule="auto"/>
+        <w:rPr>
+          <w:b w:val="1"/>
+          <w:bCs w:val="1"/>
+        </w:rPr>
+      </w:pPr>
+      <w:r>
+        <w:rPr>
+          <w:b w:val="1"/>
+          <w:bCs w:val="1"/>
+          <w:rtl w:val="0"/>
+        </w:rPr>
+        <w:t xml:space="preserve">4.4 Still to do for the build phase</w:t>
       </w:r>
     </w:p>
     <w:p>
@@ -2943,78 +3418,14 @@
           <w:ilvl w:val="0"/>
           <w:numId w:val="13"/>
         </w:numPr>
-        <w:spacing w:after="0" w:afterAutospacing="0" w:before="0" w:beforeAutospacing="0" w:lineRule="auto"/>
-        <w:ind w:left="720" w:hanging="360"/>
-      </w:pPr>
-      <w:r>
-        <w:rPr>
-          <w:rtl w:val="0"/>
-        </w:rPr>
-        <w:t xml:space="preserve">readingToTemp(reading): converts an ADC reading to °C by calling stepsToVoltage, then voltageToTemp</w:t>
-      </w:r>
-    </w:p>
-    <w:p>
-      <w:pPr>
-        <w:numPr>
-          <w:ilvl w:val="0"/>
-          <w:numId w:val="13"/>
-        </w:numPr>
-        <w:spacing w:after="0" w:afterAutospacing="0" w:before="0" w:beforeAutospacing="0" w:lineRule="auto"/>
-        <w:ind w:left="720" w:hanging="360"/>
-      </w:pPr>
-      <w:r>
-        <w:rPr>
-          <w:rtl w:val="0"/>
-        </w:rPr>
-        <w:t xml:space="preserve">findHighest(temperatures, count): returns the highest temperature in array</w:t>
-      </w:r>
-    </w:p>
-    <w:p>
-      <w:pPr>
-        <w:numPr>
-          <w:ilvl w:val="0"/>
-          <w:numId w:val="13"/>
-        </w:numPr>
-        <w:spacing w:after="0" w:afterAutospacing="0" w:before="0" w:beforeAutospacing="0" w:lineRule="auto"/>
-        <w:ind w:left="720" w:hanging="360"/>
-      </w:pPr>
-      <w:r>
-        <w:rPr>
-          <w:rtl w:val="0"/>
-        </w:rPr>
-        <w:t xml:space="preserve">checkLed(temperature): returns true if the temperature in argument is above 60 °C.</w:t>
-      </w:r>
-    </w:p>
-    <w:p>
-      <w:pPr>
-        <w:numPr>
-          <w:ilvl w:val="0"/>
-          <w:numId w:val="13"/>
-        </w:numPr>
-        <w:spacing w:after="0" w:afterAutospacing="0" w:before="0" w:beforeAutospacing="0" w:lineRule="auto"/>
-        <w:ind w:left="720" w:hanging="360"/>
-      </w:pPr>
-      <w:r>
-        <w:rPr>
-          <w:rtl w:val="0"/>
-        </w:rPr>
-        <w:t xml:space="preserve">ledControl(fault): Controls LED. Returns nothing.</w:t>
-      </w:r>
-    </w:p>
-    <w:p>
-      <w:pPr>
-        <w:numPr>
-          <w:ilvl w:val="0"/>
-          <w:numId w:val="13"/>
-        </w:numPr>
-        <w:spacing w:after="0" w:afterAutospacing="0" w:before="0" w:beforeAutospacing="0" w:lineRule="auto"/>
-        <w:ind w:left="720" w:hanging="360"/>
-      </w:pPr>
-      <w:r>
-        <w:rPr>
-          <w:rtl w:val="0"/>
-        </w:rPr>
-        <w:t xml:space="preserve">i2cSend(temperature): sends the highest temperature over I2C. Returns nothing.</w:t>
+        <w:spacing w:after="0" w:afterAutospacing="0" w:before="240" w:lineRule="auto"/>
+        <w:ind w:left="720" w:hanging="360"/>
+      </w:pPr>
+      <w:r>
+        <w:rPr>
+          <w:rtl w:val="0"/>
+        </w:rPr>
+        <w:t xml:space="preserve">Implement and test against calculations</w:t>
       </w:r>
     </w:p>
     <w:p>
@@ -3025,396 +3436,12 @@
         </w:numPr>
         <w:spacing w:after="240" w:before="0" w:beforeAutospacing="0" w:lineRule="auto"/>
         <w:ind w:left="720" w:hanging="360"/>
-        <w:rPr>
-          <w:u w:val="none"/>
-        </w:rPr>
-      </w:pPr>
-      <w:r>
-        <w:rPr>
-          <w:rtl w:val="0"/>
-        </w:rPr>
-        <w:t xml:space="preserve">analogRead(pin): built-in Arduino function [3]. Reads the voltage on the given analog pin (the mux output, </w:t>
-      </w:r>
-      <w:r>
-        <w:rPr>
-          <w:rFonts w:ascii="Roboto Mono" w:cs="Roboto Mono" w:eastAsia="Roboto Mono" w:hAnsi="Roboto Mono"/>
-          <w:color w:val="188038"/>
-          <w:rtl w:val="0"/>
-        </w:rPr>
-        <w:t xml:space="preserve">MUX_PIN</w:t>
-      </w:r>
-      <w:r>
-        <w:rPr>
-          <w:rtl w:val="0"/>
-        </w:rPr>
-        <w:t xml:space="preserve">) with the 10-bit ADC and returns a value from 0 to 1023. </w:t>
-      </w:r>
-    </w:p>
-    <w:p>
-      <w:pPr>
-        <w:spacing w:after="240" w:before="240" w:lineRule="auto"/>
-        <w:ind w:left="720" w:firstLine="0"/>
-        <w:rPr/>
-      </w:pPr>
-      <w:r>
-        <w:rPr>
-          <w:rtl w:val="0"/>
-        </w:rPr>
-        <w:t xml:space="preserve">Helper Functions</w:t>
-      </w:r>
-    </w:p>
-    <w:p>
-      <w:pPr>
-        <w:numPr>
-          <w:ilvl w:val="0"/>
-          <w:numId w:val="13"/>
-        </w:numPr>
-        <w:spacing w:after="0" w:afterAutospacing="0" w:before="240" w:lineRule="auto"/>
-        <w:ind w:left="720" w:hanging="360"/>
-      </w:pPr>
-      <w:r>
-        <w:rPr>
-          <w:rtl w:val="0"/>
-        </w:rPr>
-        <w:t xml:space="preserve">stepsToVoltage(reading): converts an ADC reading to volts: V = reading × V_ref ÷ 1024.</w:t>
-      </w:r>
-    </w:p>
-    <w:p>
-      <w:pPr>
-        <w:numPr>
-          <w:ilvl w:val="0"/>
-          <w:numId w:val="13"/>
-        </w:numPr>
-        <w:spacing w:after="240" w:before="0" w:beforeAutospacing="0" w:lineRule="auto"/>
-        <w:ind w:left="720" w:hanging="360"/>
-      </w:pPr>
-      <w:r>
-        <w:rPr>
-          <w:rtl w:val="0"/>
-        </w:rPr>
-        <w:t xml:space="preserve">voltageToTemp(voltage): converts volts to °C using the datasheet table.</w:t>
-      </w:r>
-    </w:p>
-    <w:p>
-      <w:pPr>
-        <w:spacing w:after="240" w:before="240" w:lineRule="auto"/>
-        <w:rPr>
-          <w:b w:val="1"/>
-          <w:bCs w:val="1"/>
-        </w:rPr>
-      </w:pPr>
-      <w:r>
-        <w:rPr>
-          <w:b w:val="1"/>
-          <w:bCs w:val="1"/>
-          <w:rtl w:val="0"/>
-        </w:rPr>
-        <w:t xml:space="preserve">4.2 Design decisions</w:t>
-      </w:r>
-    </w:p>
-    <w:p>
-      <w:pPr>
-        <w:numPr>
-          <w:ilvl w:val="0"/>
-          <w:numId w:val="11"/>
-        </w:numPr>
-        <w:spacing w:after="0" w:afterAutospacing="0" w:before="240" w:lineRule="auto"/>
-        <w:ind w:left="720" w:hanging="360"/>
-      </w:pPr>
-      <w:r>
-        <w:rPr>
-          <w:rtl w:val="0"/>
-        </w:rPr>
-        <w:t xml:space="preserve">One value per conversion function. Each conversion helper takes one value and returns one value, so each can be tested against hand calculations: for example, a reading of 400 should give 1.9531 V and 17.63 °C. loop() stores each result in the array.</w:t>
-      </w:r>
-    </w:p>
-    <w:p>
-      <w:pPr>
-        <w:numPr>
-          <w:ilvl w:val="0"/>
-          <w:numId w:val="11"/>
-        </w:numPr>
-        <w:spacing w:after="0" w:afterAutospacing="0" w:before="0" w:beforeAutospacing="0" w:lineRule="auto"/>
-        <w:ind w:left="720" w:hanging="360"/>
-      </w:pPr>
-      <w:r>
-        <w:rPr>
-          <w:rFonts w:ascii="Arial Unicode MS" w:cs="Arial Unicode MS" w:eastAsia="Arial Unicode MS" w:hAnsi="Arial Unicode MS"/>
-          <w:rtl w:val="0"/>
-        </w:rPr>
-        <w:t xml:space="preserve">Sensor table as a constant. The 33 datasheet voltages (−40 °C to 120 °C in 5 °C steps) are stored once as a const array. Temperatures are evenly spaced, so a table index converts directly to a temperature and only voltages need storing.[1]</w:t>
-      </w:r>
-    </w:p>
-    <w:p>
-      <w:pPr>
-        <w:numPr>
-          <w:ilvl w:val="0"/>
-          <w:numId w:val="11"/>
-        </w:numPr>
-        <w:spacing w:after="0" w:afterAutospacing="0" w:before="0" w:beforeAutospacing="0" w:lineRule="auto"/>
-        <w:ind w:left="720" w:hanging="360"/>
-      </w:pPr>
-      <w:r>
-        <w:rPr>
-          <w:rtl w:val="0"/>
-        </w:rPr>
-        <w:t xml:space="preserve">Channel count as a single constant.[4,5] NUM_CHANNELS sizes the array and bounds the loop. It is 16 for the CD74HC4067 schematic and 8 for the CD4051BE build, so switching requires one edit. The CD4051BE also uses 3 select lines instead of 4, so the select-line pin constants change with it.</w:t>
-      </w:r>
-    </w:p>
-    <w:p>
-      <w:pPr>
-        <w:numPr>
-          <w:ilvl w:val="0"/>
-          <w:numId w:val="11"/>
-        </w:numPr>
-        <w:spacing w:after="0" w:afterAutospacing="0" w:before="0" w:beforeAutospacing="0" w:lineRule="auto"/>
-        <w:ind w:left="720" w:hanging="360"/>
-      </w:pPr>
-      <w:r>
-        <w:rPr>
-          <w:rtl w:val="0"/>
-        </w:rPr>
-        <w:t xml:space="preserve">Temperature array passed with its count. findHighest receives the array and the count as arguments rather than reading a global, so it works for any channel count and can be tested with made-up arrays.</w:t>
-      </w:r>
-    </w:p>
-    <w:p>
-      <w:pPr>
-        <w:numPr>
-          <w:ilvl w:val="0"/>
-          <w:numId w:val="11"/>
-        </w:numPr>
-        <w:spacing w:after="0" w:afterAutospacing="0" w:before="0" w:beforeAutospacing="0" w:lineRule="auto"/>
-        <w:ind w:left="720" w:hanging="360"/>
-      </w:pPr>
-      <w:r>
-        <w:rPr>
-          <w:rtl w:val="0"/>
-        </w:rPr>
-        <w:t xml:space="preserve">The sensor is non-linear, and the datasheet recommends linear interpolation between table values for reasonable accuracy, so I just used that.</w:t>
-      </w:r>
-    </w:p>
-    <w:p>
-      <w:pPr>
-        <w:numPr>
-          <w:ilvl w:val="0"/>
-          <w:numId w:val="11"/>
-        </w:numPr>
-        <w:spacing w:after="0" w:afterAutospacing="0" w:before="0" w:beforeAutospacing="0" w:lineRule="auto"/>
-        <w:ind w:left="720" w:hanging="360"/>
-        <w:rPr>
-          <w:u w:val="none"/>
-        </w:rPr>
-      </w:pPr>
-      <w:r>
-        <w:rPr>
-          <w:rtl w:val="0"/>
-        </w:rPr>
-        <w:t xml:space="preserve">I thought about using a 2d array but realized having both int and float in 2d array isn't possible. </w:t>
-      </w:r>
-    </w:p>
-    <w:p>
-      <w:pPr>
-        <w:numPr>
-          <w:ilvl w:val="0"/>
-          <w:numId w:val="11"/>
-        </w:numPr>
-        <w:spacing w:after="0" w:afterAutospacing="0" w:before="0" w:beforeAutospacing="0" w:lineRule="auto"/>
-        <w:ind w:left="720" w:hanging="360"/>
-      </w:pPr>
-      <w:r>
-        <w:rPr>
-          <w:rtl w:val="0"/>
-        </w:rPr>
-        <w:t xml:space="preserve">ADC conversion uses 1024,[2] matching the ATmega328P datasheet’s conversion formula. The difference from 1023 is about 0.1%.</w:t>
-      </w:r>
-    </w:p>
-    <w:p>
-      <w:pPr>
-        <w:numPr>
-          <w:ilvl w:val="0"/>
-          <w:numId w:val="11"/>
-        </w:numPr>
-        <w:spacing w:after="240" w:before="0" w:beforeAutospacing="0" w:lineRule="auto"/>
-        <w:ind w:left="720" w:hanging="360"/>
-      </w:pPr>
-      <w:r>
-        <w:rPr>
-          <w:rtl w:val="0"/>
-        </w:rPr>
-        <w:t xml:space="preserve">MUX settling. After switching channels, the firmware waits briefly before reading so the output reflects the newly selected sensor. The delay is sized during the build phase.</w:t>
-      </w:r>
-    </w:p>
-    <w:p>
-      <w:pPr>
-        <w:spacing w:after="240" w:before="240" w:lineRule="auto"/>
-        <w:ind w:left="0" w:firstLine="0"/>
-        <w:rPr>
-          <w:b w:val="1"/>
-          <w:bCs w:val="1"/>
-        </w:rPr>
-      </w:pPr>
-      <w:r>
-        <w:rPr>
-          <w:b w:val="1"/>
-          <w:bCs w:val="1"/>
-          <w:rtl w:val="0"/>
-        </w:rPr>
-        <w:t xml:space="preserve">4.3 Math Explanation</w:t>
-      </w:r>
-    </w:p>
-    <w:p>
-      <w:pPr>
-        <w:spacing w:after="240" w:before="240" w:lineRule="auto"/>
-        <w:ind w:left="0" w:firstLine="0"/>
-        <w:rPr/>
-      </w:pPr>
-      <w:r>
-        <w:rPr>
-          <w:rtl w:val="0"/>
-        </w:rPr>
-        <w:t xml:space="preserve">Step 1: ADC reading to voltage: The Nano's ADC is 10-bit, so the reading is numbered from 0 to 1023, with a 5 V reference, so V = reading × 5 / 1024 One count (LSB) is 5 / 1024 = 4.88 mV.[2] </w:t>
-      </w:r>
-    </w:p>
-    <w:p>
-      <w:pPr>
-        <w:spacing w:after="240" w:before="240" w:lineRule="auto"/>
-        <w:ind w:left="0" w:firstLine="0"/>
-        <w:rPr/>
-      </w:pPr>
-      <w:r>
-        <w:rPr>
-          <w:rFonts w:ascii="Arial Unicode MS" w:cs="Arial Unicode MS" w:eastAsia="Arial Unicode MS" w:hAnsi="Arial Unicode MS"/>
-          <w:rtl w:val="0"/>
-        </w:rPr>
-        <w:t xml:space="preserve">Step 2: Voltage to temperature (linear interpolation) The sensor table lists voltages from −40 °C to 120 °C in 5 °C steps. Table index k corresponds to: T(k) = −40 + 5k The firmware finds the two entries the voltage falls between, V(k) ≥ V &gt; V(k+1), and interpolates linearly: fraction = (V(k) − V) / (V(k) − V(k+1)) T = T(k) + 5 × fraction Because the sensor's voltage falls as temperature rises, V(k) is the higher voltage and T(k) the lower temperature.</w:t>
-      </w:r>
-    </w:p>
-    <w:p>
-      <w:pPr>
-        <w:spacing w:after="240" w:before="240" w:lineRule="auto"/>
-        <w:ind w:left="0" w:firstLine="0"/>
-        <w:rPr/>
-      </w:pPr>
-      <w:r>
-        <w:rPr>
-          <w:rtl w:val="0"/>
-        </w:rPr>
-        <w:t xml:space="preserve"> Worked example 1: </w:t>
-      </w:r>
-    </w:p>
-    <w:p>
-      <w:pPr>
-        <w:numPr>
-          <w:ilvl w:val="0"/>
-          <w:numId w:val="9"/>
-        </w:numPr>
-        <w:spacing w:after="0" w:afterAutospacing="0" w:before="240" w:lineRule="auto"/>
-        <w:ind w:left="720" w:hanging="360"/>
-        <w:rPr>
-          <w:u w:val="none"/>
-        </w:rPr>
-      </w:pPr>
-      <w:r>
-        <w:rPr>
-          <w:rtl w:val="0"/>
-        </w:rPr>
-        <w:t xml:space="preserve">Reading 400 V = 400 × 5 / 1024 = 1.9531 V </w:t>
-      </w:r>
-    </w:p>
-    <w:p>
-      <w:pPr>
-        <w:numPr>
-          <w:ilvl w:val="0"/>
-          <w:numId w:val="9"/>
-        </w:numPr>
-        <w:spacing w:after="0" w:afterAutospacing="0" w:before="0" w:beforeAutospacing="0" w:lineRule="auto"/>
-        <w:ind w:left="720" w:hanging="360"/>
-        <w:rPr>
-          <w:u w:val="none"/>
-        </w:rPr>
-      </w:pPr>
-      <w:r>
-        <w:rPr>
-          <w:rFonts w:ascii="Arial Unicode MS" w:cs="Arial Unicode MS" w:eastAsia="Arial Unicode MS" w:hAnsi="Arial Unicode MS"/>
-          <w:rtl w:val="0"/>
-        </w:rPr>
-        <w:t xml:space="preserve">15 °C (1.99 V) and 20 °C (1.92 V) fraction = (1.99 − 1.9531) / (1.99 − 1.92) = 0.0369 / 0.07 = 0.527</w:t>
-      </w:r>
-    </w:p>
-    <w:p>
-      <w:pPr>
-        <w:numPr>
-          <w:ilvl w:val="0"/>
-          <w:numId w:val="9"/>
-        </w:numPr>
-        <w:spacing w:after="240" w:before="0" w:beforeAutospacing="0" w:lineRule="auto"/>
-        <w:ind w:left="720" w:hanging="360"/>
-        <w:rPr>
-          <w:u w:val="none"/>
-        </w:rPr>
-      </w:pPr>
-      <w:r>
-        <w:rPr>
-          <w:rtl w:val="0"/>
-        </w:rPr>
-        <w:t xml:space="preserve">15 + 5 × 0.527 = 17.63 °C (no fault</w:t>
-      </w:r>
-      <w:r>
-        <w:rPr>
-          <w:b w:val="1"/>
-          <w:bCs w:val="1"/>
-          <w:rtl w:val="0"/>
-        </w:rPr>
-        <w:t xml:space="preserve">) </w:t>
-      </w:r>
-    </w:p>
-    <w:p>
-      <w:pPr>
-        <w:spacing w:after="240" w:before="240" w:lineRule="auto"/>
-        <w:rPr>
-          <w:b w:val="1"/>
-          <w:bCs w:val="1"/>
-        </w:rPr>
-      </w:pPr>
-      <w:r>
-        <w:rPr>
-          <w:b w:val="1"/>
-          <w:bCs w:val="1"/>
-          <w:rtl w:val="0"/>
-        </w:rPr>
-        <w:t xml:space="preserve">4.4 Still to do for the build phase</w:t>
-      </w:r>
-    </w:p>
-    <w:p>
-      <w:pPr>
-        <w:numPr>
-          <w:ilvl w:val="0"/>
-          <w:numId w:val="15"/>
-        </w:numPr>
-        <w:spacing w:after="0" w:afterAutospacing="0" w:before="240" w:lineRule="auto"/>
-        <w:ind w:left="720" w:hanging="360"/>
-      </w:pPr>
-      <w:r>
-        <w:rPr>
-          <w:rtl w:val="0"/>
-        </w:rPr>
-        <w:t xml:space="preserve">Implement and test against calculations</w:t>
-      </w:r>
-    </w:p>
-    <w:p>
-      <w:pPr>
-        <w:numPr>
-          <w:ilvl w:val="0"/>
-          <w:numId w:val="15"/>
-        </w:numPr>
-        <w:spacing w:after="240" w:before="0" w:beforeAutospacing="0" w:lineRule="auto"/>
-        <w:ind w:left="720" w:hanging="360"/>
-      </w:pPr>
-      <w:r>
-        <w:rPr>
-          <w:rtl w:val="0"/>
-        </w:rPr>
-        <w:t xml:space="preserve">Handle readings outside the table range (below 1.30 V or above 2.44 V) (might not be necessary)</w:t>
+      </w:pPr>
+      <w:r>
+        <w:rPr>
+          <w:rtl w:val="0"/>
+        </w:rPr>
+        <w:t xml:space="preserve">Handle readings outside the table range (below 1.30 V or above 2.44 V)</w:t>
       </w:r>
       <w:r>
         <w:rPr>
@@ -3457,7 +3484,7 @@
         <w:rPr>
           <w:rtl w:val="0"/>
         </w:rPr>
-        <w:t xml:space="preserve">Placeholder until real thing</w:t>
+        <w:t xml:space="preserve">No build yet</w:t>
       </w:r>
       <w:r>
         <w:rPr>
@@ -5320,226 +5347,6 @@
     </w:lvl>
   </w:abstractNum>
   <w:abstractNum w:abstractNumId="15">
-    <w:lvl w:ilvl="0">
-      <w:start w:val="1"/>
-      <w:numFmt w:val="bullet"/>
-      <w:lvlText w:val="●"/>
-      <w:lvlJc w:val="left"/>
-      <w:pPr>
-        <w:ind w:left="720" w:hanging="360"/>
-      </w:pPr>
-      <w:rPr>
-        <w:u w:val="none"/>
-      </w:rPr>
-    </w:lvl>
-    <w:lvl w:ilvl="1">
-      <w:start w:val="1"/>
-      <w:numFmt w:val="bullet"/>
-      <w:lvlText w:val="○"/>
-      <w:lvlJc w:val="left"/>
-      <w:pPr>
-        <w:ind w:left="1440" w:hanging="360"/>
-      </w:pPr>
-      <w:rPr>
-        <w:u w:val="none"/>
-      </w:rPr>
-    </w:lvl>
-    <w:lvl w:ilvl="2">
-      <w:start w:val="1"/>
-      <w:numFmt w:val="bullet"/>
-      <w:lvlText w:val="■"/>
-      <w:lvlJc w:val="left"/>
-      <w:pPr>
-        <w:ind w:left="2160" w:hanging="360"/>
-      </w:pPr>
-      <w:rPr>
-        <w:u w:val="none"/>
-      </w:rPr>
-    </w:lvl>
-    <w:lvl w:ilvl="3">
-      <w:start w:val="1"/>
-      <w:numFmt w:val="bullet"/>
-      <w:lvlText w:val="●"/>
-      <w:lvlJc w:val="left"/>
-      <w:pPr>
-        <w:ind w:left="2880" w:hanging="360"/>
-      </w:pPr>
-      <w:rPr>
-        <w:u w:val="none"/>
-      </w:rPr>
-    </w:lvl>
-    <w:lvl w:ilvl="4">
-      <w:start w:val="1"/>
-      <w:numFmt w:val="bullet"/>
-      <w:lvlText w:val="○"/>
-      <w:lvlJc w:val="left"/>
-      <w:pPr>
-        <w:ind w:left="3600" w:hanging="360"/>
-      </w:pPr>
-      <w:rPr>
-        <w:u w:val="none"/>
-      </w:rPr>
-    </w:lvl>
-    <w:lvl w:ilvl="5">
-      <w:start w:val="1"/>
-      <w:numFmt w:val="bullet"/>
-      <w:lvlText w:val="■"/>
-      <w:lvlJc w:val="left"/>
-      <w:pPr>
-        <w:ind w:left="4320" w:hanging="360"/>
-      </w:pPr>
-      <w:rPr>
-        <w:u w:val="none"/>
-      </w:rPr>
-    </w:lvl>
-    <w:lvl w:ilvl="6">
-      <w:start w:val="1"/>
-      <w:numFmt w:val="bullet"/>
-      <w:lvlText w:val="●"/>
-      <w:lvlJc w:val="left"/>
-      <w:pPr>
-        <w:ind w:left="5040" w:hanging="360"/>
-      </w:pPr>
-      <w:rPr>
-        <w:u w:val="none"/>
-      </w:rPr>
-    </w:lvl>
-    <w:lvl w:ilvl="7">
-      <w:start w:val="1"/>
-      <w:numFmt w:val="bullet"/>
-      <w:lvlText w:val="○"/>
-      <w:lvlJc w:val="left"/>
-      <w:pPr>
-        <w:ind w:left="5760" w:hanging="360"/>
-      </w:pPr>
-      <w:rPr>
-        <w:u w:val="none"/>
-      </w:rPr>
-    </w:lvl>
-    <w:lvl w:ilvl="8">
-      <w:start w:val="1"/>
-      <w:numFmt w:val="bullet"/>
-      <w:lvlText w:val="■"/>
-      <w:lvlJc w:val="left"/>
-      <w:pPr>
-        <w:ind w:left="6480" w:hanging="360"/>
-      </w:pPr>
-      <w:rPr>
-        <w:u w:val="none"/>
-      </w:rPr>
-    </w:lvl>
-  </w:abstractNum>
-  <w:abstractNum w:abstractNumId="16">
-    <w:lvl w:ilvl="0">
-      <w:start w:val="1"/>
-      <w:numFmt w:val="bullet"/>
-      <w:lvlText w:val="●"/>
-      <w:lvlJc w:val="left"/>
-      <w:pPr>
-        <w:ind w:left="720" w:hanging="360"/>
-      </w:pPr>
-      <w:rPr>
-        <w:u w:val="none"/>
-      </w:rPr>
-    </w:lvl>
-    <w:lvl w:ilvl="1">
-      <w:start w:val="1"/>
-      <w:numFmt w:val="bullet"/>
-      <w:lvlText w:val="○"/>
-      <w:lvlJc w:val="left"/>
-      <w:pPr>
-        <w:ind w:left="1440" w:hanging="360"/>
-      </w:pPr>
-      <w:rPr>
-        <w:u w:val="none"/>
-      </w:rPr>
-    </w:lvl>
-    <w:lvl w:ilvl="2">
-      <w:start w:val="1"/>
-      <w:numFmt w:val="bullet"/>
-      <w:lvlText w:val="■"/>
-      <w:lvlJc w:val="left"/>
-      <w:pPr>
-        <w:ind w:left="2160" w:hanging="360"/>
-      </w:pPr>
-      <w:rPr>
-        <w:u w:val="none"/>
-      </w:rPr>
-    </w:lvl>
-    <w:lvl w:ilvl="3">
-      <w:start w:val="1"/>
-      <w:numFmt w:val="bullet"/>
-      <w:lvlText w:val="●"/>
-      <w:lvlJc w:val="left"/>
-      <w:pPr>
-        <w:ind w:left="2880" w:hanging="360"/>
-      </w:pPr>
-      <w:rPr>
-        <w:u w:val="none"/>
-      </w:rPr>
-    </w:lvl>
-    <w:lvl w:ilvl="4">
-      <w:start w:val="1"/>
-      <w:numFmt w:val="bullet"/>
-      <w:lvlText w:val="○"/>
-      <w:lvlJc w:val="left"/>
-      <w:pPr>
-        <w:ind w:left="3600" w:hanging="360"/>
-      </w:pPr>
-      <w:rPr>
-        <w:u w:val="none"/>
-      </w:rPr>
-    </w:lvl>
-    <w:lvl w:ilvl="5">
-      <w:start w:val="1"/>
-      <w:numFmt w:val="bullet"/>
-      <w:lvlText w:val="■"/>
-      <w:lvlJc w:val="left"/>
-      <w:pPr>
-        <w:ind w:left="4320" w:hanging="360"/>
-      </w:pPr>
-      <w:rPr>
-        <w:u w:val="none"/>
-      </w:rPr>
-    </w:lvl>
-    <w:lvl w:ilvl="6">
-      <w:start w:val="1"/>
-      <w:numFmt w:val="bullet"/>
-      <w:lvlText w:val="●"/>
-      <w:lvlJc w:val="left"/>
-      <w:pPr>
-        <w:ind w:left="5040" w:hanging="360"/>
-      </w:pPr>
-      <w:rPr>
-        <w:u w:val="none"/>
-      </w:rPr>
-    </w:lvl>
-    <w:lvl w:ilvl="7">
-      <w:start w:val="1"/>
-      <w:numFmt w:val="bullet"/>
-      <w:lvlText w:val="○"/>
-      <w:lvlJc w:val="left"/>
-      <w:pPr>
-        <w:ind w:left="5760" w:hanging="360"/>
-      </w:pPr>
-      <w:rPr>
-        <w:u w:val="none"/>
-      </w:rPr>
-    </w:lvl>
-    <w:lvl w:ilvl="8">
-      <w:start w:val="1"/>
-      <w:numFmt w:val="bullet"/>
-      <w:lvlText w:val="■"/>
-      <w:lvlJc w:val="left"/>
-      <w:pPr>
-        <w:ind w:left="6480" w:hanging="360"/>
-      </w:pPr>
-      <w:rPr>
-        <w:u w:val="none"/>
-      </w:rPr>
-    </w:lvl>
-  </w:abstractNum>
-  <w:abstractNum w:abstractNumId="17">
     <w:lvl w:ilvl="0">
       <w:start w:val="1"/>
       <w:numFmt w:val="bullet"/>
@@ -5693,12 +5500,6 @@
   </w:num>
   <w:num w:numId="15">
     <w:abstractNumId w:val="15"/>
-  </w:num>
-  <w:num w:numId="16">
-    <w:abstractNumId w:val="16"/>
-  </w:num>
-  <w:num w:numId="17">
-    <w:abstractNumId w:val="17"/>
   </w:num>
 </w:numbering>
 </file>

</xml_diff>